<commit_message>
Documentar ejecución exitosa en GitHub Actions
</commit_message>
<xml_diff>
--- a/Alexis_Hernandez.docx
+++ b/Alexis_Hernandez.docx
@@ -110,7 +110,7 @@
           <w:rFonts w:ascii="Arial" w:hAnsi="Arial"/>
           <w:sz w:val="24"/>
         </w:rPr>
-        <w:t xml:space="preserve">La clase Calculadora implementa suma y resta con detecciÃ³n de desbordamiento. La clase App expone /health y /calculate. Se eligiÃ³ JUnit 5 para las pruebas; Selenium no aporta valor en esta aplicaciÃ³n sin interfaz grÃ¡fica. Para publicar en GitHub, se debe crear un repositorio vacÃ­o y usar los comandos de README.md. No se declara un enlace remoto que aÃºn no existe.</w:t>
+        <w:t xml:space="preserve">La clase Calculadora implementa suma y resta con detecciÃ³n de desbordamiento. La clase App expone /health y /calculate. Se eligiÃ³ JUnit 5 para las pruebas; Selenium no aporta valor en esta aplicaciÃ³n sin interfaz grÃ¡fica. Repositorio publicado: https://github.com/a-hernandez88/iplacex. Las ramas main y feature/primer-test son visibles en GitHub.</w:t>
       </w:r>
     </w:p>
     <w:p>
@@ -147,7 +147,7 @@
           <w:rFonts w:ascii="Arial" w:hAnsi="Arial"/>
           <w:sz w:val="24"/>
         </w:rPr>
-        <w:t xml:space="preserve">Evidencia local: evidence/verify-local.log registra BUILD SUCCESS; 3 pruebas unitarias y 3 pruebas de integraciÃ³n, sin errores ni fallos. Esta evidencia corresponde a Maven local. La ejecuciÃ³n en GitHub Actions deberÃ¡ realizarse despuÃ©s de publicar el repositorio, y sus capturas se pueden aÃ±adir desde la pestaÃ±a Actions.</w:t>
+        <w:t xml:space="preserve">Evidencia local: evidence/verify-local.log registra BUILD SUCCESS; 3 pruebas unitarias y 3 pruebas de integraciÃ³n, sin errores ni fallos. Evidencia en GitHub: https://github.com/a-hernandez88/iplacex/actions/runs/35622120211 terminÃ³ exitosamente, con build, unit-tests, integration-tests y acceptance-deploy-rollback en estado success. El detalle y los enlaces de jobs se encuentran en evidence/github-actions.txt.</w:t>
       </w:r>
     </w:p>
     <w:p>
@@ -209,7 +209,7 @@
           <w:rFonts w:ascii="Arial" w:hAnsi="Arial"/>
           <w:sz w:val="24"/>
         </w:rPr>
-        <w:t xml:space="preserve">Desde examen-final: mvn -B test ejecuta unitarias; mvn -B verify ejecuta build, unitarias e integraciÃ³n; bash deployment/deploy-demo.sh ejecuta aceptaciÃ³n, despliegue y rollback. El repositorio incluye pom.xml, cÃ³digo fuente, workflow, scripts, README.md y logs de evidencia. La publicaciÃ³n en GitHub y las capturas de Actions requieren ejecutarse desde la cuenta del estudiante.</w:t>
+        <w:t xml:space="preserve">Desde examen-final: mvn -B test ejecuta unitarias; mvn -B verify ejecuta build, unitarias e integraciÃ³n; bash deployment/deploy-demo.sh ejecuta aceptaciÃ³n, despliegue y rollback. El repositorio publicado incluye pom.xml, cÃ³digo fuente, workflow, scripts, README.md, logs locales y evidencia de GitHub Actions.</w:t>
       </w:r>
     </w:p>
     <w:p>
@@ -234,7 +234,7 @@
           <w:rFonts w:ascii="Arial" w:hAnsi="Arial"/>
           <w:sz w:val="24"/>
         </w:rPr>
-        <w:t xml:space="preserve">ConfiguraciÃ³n y funcionalidad: Git, Maven, JUnit y pipeline comprobados localmente. Cumplimiento: las tres actividades disponen de archivos ejecutables y evidencias; queda pendiente Ãºnicamente publicar en GitHub y registrar capturas del servicio. CÃ³digo limpio: separaciÃ³n entre aplicaciÃ³n, pruebas y despliegue, nombres descriptivos y flujo de ramas definido. PresentaciÃ³n: README, informe y logs trazables.</w:t>
+        <w:t xml:space="preserve">ConfiguraciÃ³n y funcionalidad: Git, Maven, JUnit y pipeline comprobados localmente y en GitHub Actions. Cumplimiento: las tres actividades disponen de archivos ejecutables y evidencias pÃºblicas del run. CÃ³digo limpio: separaciÃ³n entre aplicaciÃ³n, pruebas y despliegue, nombres descriptivos y flujo de ramas definido. PresentaciÃ³n: README, informe, logs y enlaces verificables.</w:t>
       </w:r>
     </w:p>
     <w:p>

</xml_diff>